<commit_message>
feat: overhaul error handling for conversion screen
</commit_message>
<xml_diff>
--- a/composeApp/packaging/resources/common/bazinis_šablonas.docx
+++ b/composeApp/packaging/resources/common/bazinis_šablonas.docx
@@ -212,6 +212,7 @@
         </w:rPr>
       </w:pPr>
       <w:bookmarkStart w:id="0" w:name="OLE_LINK1"/>
+      <w:bookmarkStart w:id="1" w:name="OLE_LINK8"/>
       <w:r>
         <w:rPr>
           <w:rFonts w:ascii="Arial" w:eastAsia="Calibri" w:hAnsi="Arial" w:cs="Arial"/>
@@ -335,7 +336,7 @@
           <w:szCs w:val="56"/>
         </w:rPr>
       </w:pPr>
-      <w:bookmarkStart w:id="1" w:name="OLE_LINK4"/>
+      <w:bookmarkStart w:id="2" w:name="OLE_LINK4"/>
       <w:r>
         <w:rPr>
           <w:rFonts w:ascii="Times New Roman" w:eastAsia="Calibri" w:hAnsi="Times New Roman" w:cs="Times New Roman"/>
@@ -369,7 +370,7 @@
         </w:rPr>
         <w:t>}}</w:t>
       </w:r>
-      <w:bookmarkEnd w:id="1"/>
+      <w:bookmarkEnd w:id="2"/>
     </w:p>
     <w:p>
       <w:pPr>
@@ -399,7 +400,7 @@
           <w:lang w:val="en-US"/>
         </w:rPr>
       </w:pPr>
-      <w:bookmarkStart w:id="2" w:name="OLE_LINK2"/>
+      <w:bookmarkStart w:id="3" w:name="OLE_LINK2"/>
       <w:r>
         <w:rPr>
           <w:rFonts w:ascii="Times New Roman" w:eastAsia="Times New Roman" w:hAnsi="Times New Roman" w:cs="Times New Roman"/>
@@ -436,7 +437,7 @@
         </w:rPr>
         <w:t>{{</w:t>
       </w:r>
-      <w:bookmarkStart w:id="3" w:name="OLE_LINK3"/>
+      <w:bookmarkStart w:id="4" w:name="OLE_LINK3"/>
       <w:r>
         <w:rPr>
           <w:rFonts w:ascii="Times New Roman" w:eastAsia="Times New Roman" w:hAnsi="Times New Roman" w:cs="Times New Roman"/>
@@ -473,7 +474,7 @@
         </w:rPr>
         <w:t>valandos</w:t>
       </w:r>
-      <w:bookmarkEnd w:id="3"/>
+      <w:bookmarkEnd w:id="4"/>
       <w:r>
         <w:rPr>
           <w:rFonts w:ascii="Times New Roman" w:eastAsia="Times New Roman" w:hAnsi="Times New Roman" w:cs="Times New Roman"/>
@@ -501,7 +502,7 @@
         </w:rPr>
         <w:t>{{</w:t>
       </w:r>
-      <w:bookmarkStart w:id="4" w:name="OLE_LINK5"/>
+      <w:bookmarkStart w:id="5" w:name="OLE_LINK5"/>
       <w:r>
         <w:rPr>
           <w:rFonts w:ascii="Times New Roman" w:eastAsia="Times New Roman" w:hAnsi="Times New Roman" w:cs="Times New Roman"/>
@@ -520,7 +521,7 @@
         </w:rPr>
         <w:t>kreditacijos_tipas</w:t>
       </w:r>
-      <w:bookmarkEnd w:id="4"/>
+      <w:bookmarkEnd w:id="5"/>
       <w:r>
         <w:rPr>
           <w:rFonts w:ascii="Times New Roman" w:eastAsia="Times New Roman" w:hAnsi="Times New Roman" w:cs="Times New Roman"/>
@@ -531,7 +532,7 @@
         <w:t>}}</w:t>
       </w:r>
     </w:p>
-    <w:bookmarkEnd w:id="2"/>
+    <w:bookmarkEnd w:id="3"/>
     <w:p>
       <w:pPr>
         <w:widowControl/>
@@ -581,7 +582,7 @@
         </w:rPr>
         <w:t>{{</w:t>
       </w:r>
-      <w:bookmarkStart w:id="5" w:name="OLE_LINK6"/>
+      <w:bookmarkStart w:id="6" w:name="OLE_LINK6"/>
       <w:r>
         <w:rPr>
           <w:rFonts w:ascii="Times New Roman" w:eastAsia="Times New Roman" w:hAnsi="Times New Roman" w:cs="Times New Roman"/>
@@ -592,7 +593,7 @@
         </w:rPr>
         <w:t>sertifikato_pavadinimas</w:t>
       </w:r>
-      <w:bookmarkEnd w:id="5"/>
+      <w:bookmarkEnd w:id="6"/>
       <w:r>
         <w:rPr>
           <w:rFonts w:ascii="Times New Roman" w:eastAsia="Times New Roman" w:hAnsi="Times New Roman" w:cs="Times New Roman"/>
@@ -645,6 +646,7 @@
           <w:szCs w:val="28"/>
         </w:rPr>
       </w:pPr>
+      <w:bookmarkStart w:id="7" w:name="OLE_LINK9"/>
       <w:r>
         <w:rPr>
           <w:rFonts w:ascii="Times New Roman" w:eastAsia="Times New Roman" w:hAnsi="Times New Roman" w:cs="Times New Roman"/>
@@ -655,7 +657,7 @@
         </w:rPr>
         <w:t>{{</w:t>
       </w:r>
-      <w:bookmarkStart w:id="6" w:name="OLE_LINK7"/>
+      <w:bookmarkStart w:id="8" w:name="OLE_LINK7"/>
       <w:r>
         <w:rPr>
           <w:rFonts w:ascii="Times New Roman" w:eastAsia="Times New Roman" w:hAnsi="Times New Roman" w:cs="Times New Roman"/>
@@ -666,7 +668,7 @@
         </w:rPr>
         <w:t>destytojo_tipas</w:t>
       </w:r>
-      <w:bookmarkEnd w:id="6"/>
+      <w:bookmarkEnd w:id="8"/>
       <w:r>
         <w:rPr>
           <w:rFonts w:ascii="Times New Roman" w:eastAsia="Times New Roman" w:hAnsi="Times New Roman" w:cs="Times New Roman"/>
@@ -718,6 +720,7 @@
         <w:t>}}</w:t>
       </w:r>
     </w:p>
+    <w:bookmarkEnd w:id="7"/>
     <w:p>
       <w:pPr>
         <w:widowControl/>
@@ -844,6 +847,7 @@
         <w:t>}}</w:t>
       </w:r>
     </w:p>
+    <w:bookmarkEnd w:id="1"/>
     <w:p>
       <w:pPr>
         <w:widowControl/>

</xml_diff>

<commit_message>
feat: add xlsx and docx custom tagging system that user can customize
</commit_message>
<xml_diff>
--- a/composeApp/packaging/resources/common/bazinis_šablonas.docx
+++ b/composeApp/packaging/resources/common/bazinis_šablonas.docx
@@ -357,7 +357,29 @@
           <w:sz w:val="56"/>
           <w:szCs w:val="56"/>
         </w:rPr>
-        <w:t>vardas_pavarde</w:t>
+        <w:t>vardas</w:t>
+      </w:r>
+      <w:r>
+        <w:rPr>
+          <w:rFonts w:ascii="Times New Roman" w:eastAsia="Calibri" w:hAnsi="Times New Roman" w:cs="Times New Roman"/>
+          <w:b/>
+          <w:i/>
+          <w:color w:val="000000"/>
+          <w:sz w:val="56"/>
+          <w:szCs w:val="56"/>
+        </w:rPr>
+        <w:t>}} {{</w:t>
+      </w:r>
+      <w:r>
+        <w:rPr>
+          <w:rFonts w:ascii="Times New Roman" w:eastAsia="Calibri" w:hAnsi="Times New Roman" w:cs="Times New Roman"/>
+          <w:b/>
+          <w:i/>
+          <w:color w:val="000000"/>
+          <w:sz w:val="56"/>
+          <w:szCs w:val="56"/>
+        </w:rPr>
+        <w:t>pavarde</w:t>
       </w:r>
       <w:r>
         <w:rPr>

</xml_diff>